<commit_message>
docs: add official CSV submission package matrix
</commit_message>
<xml_diff>
--- a/docs/csv-validation/official-submission-package/00-送审目录与审查导读.docx
+++ b/docs/csv-validation/official-submission-package/00-送审目录与审查导读.docx
@@ -689,6 +689,37 @@
           <w:p>
             <w:r>
               <w:t xml:space="preserve">闭环证据</w:t>
+            </w:r>
+          </w:p>
+        </w:tc>
+      </w:tr>
+      <w:tr>
+        <w:trPr/>
+        <w:tc>
+          <w:p>
+            <w:r>
+              <w:t xml:space="preserve">零零A</w:t>
+            </w:r>
+          </w:p>
+        </w:tc>
+        <w:tc>
+          <w:p>
+            <w:r>
+              <w:t xml:space="preserve">正式递交说明与签字责任矩阵</w:t>
+            </w:r>
+          </w:p>
+        </w:tc>
+        <w:tc>
+          <w:p>
+            <w:r>
+              <w:t xml:space="preserve">递交口径、装订方式、签字责任和原始证据补齐门禁。</w:t>
+            </w:r>
+          </w:p>
+        </w:tc>
+        <w:tc>
+          <w:p>
+            <w:r>
+              <w:t xml:space="preserve">主目录</w:t>
             </w:r>
           </w:p>
         </w:tc>

</xml_diff>